<commit_message>
feat: add HiveMind, Saklay, SPLATZ, TraderBot, Pixel Survivor case studies
Five new work entries with covers, live screenshots, and test proof images. HiveMind and Saklay featured on homepage. Resume and downloadable CV synced with new projects (34 total).
</commit_message>
<xml_diff>
--- a/public/downloads/uzziel-malolos-resume.docx
+++ b/public/downloads/uzziel-malolos-resume.docx
@@ -100,7 +100,7 @@
           <w:rFonts w:ascii="Calibri" w:hAnsi="Calibri"/>
           <w:sz w:val="21"/>
         </w:rPr>
-        <w:t>Web Development: Astro 4, React 18, Next.js 14, TypeScript, Tailwind CSS, Vite, HTML/CSS, JavaScript</w:t>
+        <w:t>Web Development: Astro 4, Astro 5, React 18, Next.js 14, TypeScript, Tailwind CSS, Vite, WebSocket, HTML/CSS, JavaScript</w:t>
       </w:r>
     </w:p>
     <w:p>
@@ -124,7 +124,7 @@
           <w:rFonts w:ascii="Calibri" w:hAnsi="Calibri"/>
           <w:sz w:val="21"/>
         </w:rPr>
-        <w:t>AI &amp; Automation: Claude, ChatGPT, Botpress, Groq, OpenRouter API, AI-assisted workflows, Prompt engineering</w:t>
+        <w:t>AI &amp; Automation: Claude, ChatGPT, Botpress, Groq, OpenRouter API, HiveMind multi-agent orchestration, BullMQ, AI-assisted workflows, Prompt engineering</w:t>
       </w:r>
     </w:p>
     <w:p>
@@ -427,6 +427,66 @@
           <w:sz w:val="22"/>
         </w:rPr>
         <w:t>SELECTED PROJECTS (2026)</w:t>
+      </w:r>
+    </w:p>
+    <w:p>
+      <w:pPr>
+        <w:spacing w:after="40"/>
+      </w:pPr>
+      <w:r>
+        <w:rPr>
+          <w:rFonts w:ascii="Calibri" w:hAnsi="Calibri"/>
+          <w:sz w:val="21"/>
+        </w:rPr>
+        <w:t>HiveMind — Multi-agent orchestration monorepo with Obsidian vault memory, BullMQ queue, Next.js dashboard, swarm execution, Grok API streaming, and Slack/Discord bots. Phases 1–8 complete. 201/201 tests.</w:t>
+      </w:r>
+    </w:p>
+    <w:p>
+      <w:pPr>
+        <w:spacing w:after="40"/>
+      </w:pPr>
+      <w:r>
+        <w:rPr>
+          <w:rFonts w:ascii="Calibri" w:hAnsi="Calibri"/>
+          <w:sz w:val="21"/>
+        </w:rPr>
+        <w:t>Saklay Charity Website — Astro 5 donation site for Saklay foundation. Warm Hope design system, Markdown content collections, WCAG AA tooling, SEO/JSON-LD. Live on Vercel; saklay.com DNS cutover pending.</w:t>
+      </w:r>
+    </w:p>
+    <w:p>
+      <w:pPr>
+        <w:spacing w:after="40"/>
+      </w:pPr>
+      <w:r>
+        <w:rPr>
+          <w:rFonts w:ascii="Calibri" w:hAnsi="Calibri"/>
+          <w:sz w:val="21"/>
+        </w:rPr>
+        <w:t>SPLATZ — Neon 4-player co-op platformer. Phaser 3 + server-authoritative WebSocket physics + Electron + Steamworks branch. 54/54 Vitest tests. Four levels with sync buttons and portal puzzles.</w:t>
+      </w:r>
+    </w:p>
+    <w:p>
+      <w:pPr>
+        <w:spacing w:after="40"/>
+      </w:pPr>
+      <w:r>
+        <w:rPr>
+          <w:rFonts w:ascii="Calibri" w:hAnsi="Calibri"/>
+          <w:sz w:val="21"/>
+        </w:rPr>
+        <w:t>TraderBot — HiveMind-orchestrated crypto signal pipeline. Binance/yfinance data, multi-indicator consensus, risk gates, backtests with vault audit trail. Trend regime filter and threshold sweep mode.</w:t>
+      </w:r>
+    </w:p>
+    <w:p>
+      <w:pPr>
+        <w:spacing w:after="40"/>
+      </w:pPr>
+      <w:r>
+        <w:rPr>
+          <w:rFonts w:ascii="Calibri" w:hAnsi="Calibri"/>
+          <w:sz w:val="21"/>
+        </w:rPr>
+        <w:t>Pixel Survivor — Godot 4.6 bullet heaven with Megabonk-style ricocheting projectiles. 320×180 pixel pipeline, object pools, phased GDD. Phase 1 scaffold complete.</w:t>
       </w:r>
     </w:p>
     <w:p>

</xml_diff>

<commit_message>
chore: prep uzziel.dev domain wiring
Add apex/www HTTPS redirects in netlify.toml. Point resume and README to uzziel.dev. Domain must be registered and assigned in Netlify before DNS resolves.
</commit_message>
<xml_diff>
--- a/public/downloads/uzziel-malolos-resume.docx
+++ b/public/downloads/uzziel-malolos-resume.docx
@@ -38,7 +38,7 @@
         </w:rPr>
         <w:t>+63 991 387 3723  •  uzzielmalolos@gmail.com  •  Bay, Laguna, Philippines (Remote-Ready)</w:t>
         <w:br/>
-        <w:t>uzziel-portfolio.netlify.app  •  LinkedIn</w:t>
+        <w:t>uzziel.dev  •  LinkedIn</w:t>
       </w:r>
     </w:p>
     <w:p>
@@ -827,7 +827,7 @@
           <w:rFonts w:ascii="Calibri" w:hAnsi="Calibri"/>
           <w:sz w:val="21"/>
         </w:rPr>
-        <w:t>Portfolio and references: uzziel-portfolio.netlify.app</w:t>
+        <w:t>Portfolio and references: uzziel.dev</w:t>
       </w:r>
     </w:p>
     <w:sectPr>

</xml_diff>